<commit_message>
Add internal feature selection demo materials
</commit_message>
<xml_diff>
--- a/feature selection/Feature selection form.docx
+++ b/feature selection/Feature selection form.docx
@@ -122,35 +122,7 @@
         <w:rPr>
           <w:rFonts w:asciiTheme="majorHAnsi" w:hAnsiTheme="majorHAnsi" w:cstheme="majorHAnsi"/>
         </w:rPr>
-        <w:br/>
-      </w:r>
-      <w:r>
-        <w:rPr>
-          <w:rFonts w:asciiTheme="majorHAnsi" w:hAnsiTheme="majorHAnsi" w:cstheme="majorHAnsi"/>
-        </w:rPr>
-        <w:t>----------------------------------------------------------------</w:t>
-      </w:r>
-      <w:r>
-        <w:rPr>
-          <w:rFonts w:asciiTheme="majorHAnsi" w:hAnsiTheme="majorHAnsi" w:cstheme="majorHAnsi"/>
-        </w:rPr>
-        <w:br/>
-      </w:r>
-      <w:r>
-        <w:rPr>
-          <w:rFonts w:asciiTheme="majorHAnsi" w:hAnsiTheme="majorHAnsi" w:cstheme="majorHAnsi"/>
-          <w:b/>
-          <w:bCs/>
-        </w:rPr>
-        <w:t>Cohort</w:t>
-      </w:r>
-      <w:r>
-        <w:rPr>
-          <w:rFonts w:asciiTheme="majorHAnsi" w:hAnsiTheme="majorHAnsi" w:cstheme="majorHAnsi"/>
-          <w:b/>
-          <w:bCs/>
-        </w:rPr>
-        <w:t xml:space="preserve"> B:</w:t>
+        <w:t>id42_1</w:t>
       </w:r>
     </w:p>
     <w:p>
@@ -161,6 +133,165 @@
           <w:rFonts w:asciiTheme="majorHAnsi" w:hAnsiTheme="majorHAnsi" w:cstheme="majorHAnsi"/>
         </w:rPr>
       </w:pPr>
+      <w:r>
+        <w:rPr>
+          <w:rFonts w:asciiTheme="majorHAnsi" w:hAnsiTheme="majorHAnsi" w:cstheme="majorHAnsi"/>
+        </w:rPr>
+        <w:t>id42_21</w:t>
+      </w:r>
+    </w:p>
+    <w:p>
+      <w:pPr>
+        <w:spacing w:after="0" w:line="276" w:lineRule="auto"/>
+        <w:ind w:firstLine="0"/>
+        <w:rPr>
+          <w:rFonts w:asciiTheme="majorHAnsi" w:hAnsiTheme="majorHAnsi" w:cstheme="majorHAnsi"/>
+        </w:rPr>
+      </w:pPr>
+      <w:r>
+        <w:rPr>
+          <w:rFonts w:asciiTheme="majorHAnsi" w:hAnsiTheme="majorHAnsi" w:cstheme="majorHAnsi"/>
+        </w:rPr>
+        <w:t>id42_22</w:t>
+      </w:r>
+    </w:p>
+    <w:p>
+      <w:pPr>
+        <w:spacing w:after="0" w:line="276" w:lineRule="auto"/>
+        <w:ind w:firstLine="0"/>
+        <w:rPr>
+          <w:rFonts w:asciiTheme="majorHAnsi" w:hAnsiTheme="majorHAnsi" w:cstheme="majorHAnsi"/>
+        </w:rPr>
+      </w:pPr>
+      <w:r>
+        <w:rPr>
+          <w:rFonts w:asciiTheme="majorHAnsi" w:hAnsiTheme="majorHAnsi" w:cstheme="majorHAnsi"/>
+        </w:rPr>
+        <w:t>id43_1</w:t>
+      </w:r>
+    </w:p>
+    <w:p>
+      <w:pPr>
+        <w:spacing w:after="0" w:line="276" w:lineRule="auto"/>
+        <w:ind w:firstLine="0"/>
+        <w:rPr>
+          <w:rFonts w:asciiTheme="majorHAnsi" w:hAnsiTheme="majorHAnsi" w:cstheme="majorHAnsi"/>
+        </w:rPr>
+      </w:pPr>
+      <w:r>
+        <w:rPr>
+          <w:rFonts w:asciiTheme="majorHAnsi" w:hAnsiTheme="majorHAnsi" w:cstheme="majorHAnsi"/>
+        </w:rPr>
+        <w:t>id43_21</w:t>
+      </w:r>
+    </w:p>
+    <w:p>
+      <w:pPr>
+        <w:spacing w:after="0" w:line="276" w:lineRule="auto"/>
+        <w:ind w:firstLine="0"/>
+        <w:rPr>
+          <w:rFonts w:asciiTheme="majorHAnsi" w:hAnsiTheme="majorHAnsi" w:cstheme="majorHAnsi"/>
+        </w:rPr>
+      </w:pPr>
+      <w:r>
+        <w:rPr>
+          <w:rFonts w:asciiTheme="majorHAnsi" w:hAnsiTheme="majorHAnsi" w:cstheme="majorHAnsi"/>
+        </w:rPr>
+        <w:t>id43_22</w:t>
+      </w:r>
+      <w:r>
+        <w:rPr>
+          <w:rFonts w:asciiTheme="majorHAnsi" w:hAnsiTheme="majorHAnsi" w:cstheme="majorHAnsi"/>
+        </w:rPr>
+        <w:br/>
+      </w:r>
+      <w:r>
+        <w:rPr>
+          <w:rFonts w:asciiTheme="majorHAnsi" w:hAnsiTheme="majorHAnsi" w:cstheme="majorHAnsi"/>
+        </w:rPr>
+        <w:t>----------------------------------------------------------------</w:t>
+      </w:r>
+      <w:r>
+        <w:rPr>
+          <w:rFonts w:asciiTheme="majorHAnsi" w:hAnsiTheme="majorHAnsi" w:cstheme="majorHAnsi"/>
+        </w:rPr>
+        <w:br/>
+      </w:r>
+      <w:r>
+        <w:rPr>
+          <w:rFonts w:asciiTheme="majorHAnsi" w:hAnsiTheme="majorHAnsi" w:cstheme="majorHAnsi"/>
+          <w:b/>
+          <w:bCs/>
+        </w:rPr>
+        <w:t>Cohort</w:t>
+      </w:r>
+      <w:r>
+        <w:rPr>
+          <w:rFonts w:asciiTheme="majorHAnsi" w:hAnsiTheme="majorHAnsi" w:cstheme="majorHAnsi"/>
+          <w:b/>
+          <w:bCs/>
+        </w:rPr>
+        <w:t xml:space="preserve"> B:</w:t>
+      </w:r>
+    </w:p>
+    <w:p>
+      <w:pPr>
+        <w:spacing w:after="0" w:line="276" w:lineRule="auto"/>
+        <w:ind w:firstLine="0"/>
+        <w:rPr>
+          <w:rFonts w:asciiTheme="majorHAnsi" w:hAnsiTheme="majorHAnsi" w:cstheme="majorHAnsi"/>
+        </w:rPr>
+      </w:pPr>
+      <w:r>
+        <w:rPr>
+          <w:rFonts w:asciiTheme="majorHAnsi" w:hAnsiTheme="majorHAnsi" w:cstheme="majorHAnsi"/>
+        </w:rPr>
+        <w:t>M</w:t>
+      </w:r>
+      <w:r>
+        <w:rPr>
+          <w:rFonts w:asciiTheme="majorHAnsi" w:hAnsiTheme="majorHAnsi" w:cstheme="majorHAnsi"/>
+        </w:rPr>
+        <w:t>obility</w:t>
+      </w:r>
+    </w:p>
+    <w:p>
+      <w:pPr>
+        <w:spacing w:after="0" w:line="276" w:lineRule="auto"/>
+        <w:ind w:firstLine="0"/>
+        <w:rPr>
+          <w:rFonts w:asciiTheme="majorHAnsi" w:hAnsiTheme="majorHAnsi" w:cstheme="majorHAnsi"/>
+        </w:rPr>
+      </w:pPr>
+      <w:r>
+        <w:rPr>
+          <w:rFonts w:asciiTheme="majorHAnsi" w:hAnsiTheme="majorHAnsi" w:cstheme="majorHAnsi"/>
+        </w:rPr>
+        <w:t>A</w:t>
+      </w:r>
+      <w:r>
+        <w:rPr>
+          <w:rFonts w:asciiTheme="majorHAnsi" w:hAnsiTheme="majorHAnsi" w:cstheme="majorHAnsi"/>
+        </w:rPr>
+        <w:t>dl</w:t>
+      </w:r>
+    </w:p>
+    <w:p>
+      <w:pPr>
+        <w:spacing w:after="0" w:line="276" w:lineRule="auto"/>
+        <w:ind w:firstLine="0"/>
+        <w:rPr>
+          <w:rFonts w:asciiTheme="majorHAnsi" w:hAnsiTheme="majorHAnsi" w:cstheme="majorHAnsi"/>
+        </w:rPr>
+      </w:pPr>
+      <w:proofErr w:type="spellStart"/>
+      <w:r>
+        <w:rPr>
+          <w:rFonts w:asciiTheme="majorHAnsi" w:hAnsiTheme="majorHAnsi" w:cstheme="majorHAnsi"/>
+        </w:rPr>
+        <w:t>phactiv</w:t>
+      </w:r>
+      <w:proofErr w:type="spellEnd"/>
     </w:p>
     <w:sectPr>
       <w:pgSz w:w="12240" w:h="15840"/>

</xml_diff>